<commit_message>
Updated Doc and PDF Resume
</commit_message>
<xml_diff>
--- a/assets/docx-files/EvanKingResume.docx
+++ b/assets/docx-files/EvanKingResume.docx
@@ -26,6 +26,12 @@
           <w:szCs w:val="28"/>
         </w:rPr>
         <w:t>Evan King</w:t>
+      </w:r>
+      <w:r>
+        <w:rPr>
+          <w:sz w:val="28"/>
+          <w:szCs w:val="28"/>
+        </w:rPr>
       </w:r>
     </w:p>
     <w:p>
@@ -142,81 +148,106 @@
         </w:rPr>
         <w:t>GAME DEVELOPER / QA TESTER / SOFTWARE ENGINEER CANDIDATE</w:t>
       </w:r>
-    </w:p>
-    <w:p>
-      <w:pPr>
-        <w:pStyle w:val="para2"/>
-        <w:pBdr>
-          <w:top w:val="nil" w:sz="0" w:space="0" w:color="000000" tmln="20, 20, 20, 0, 0"/>
-          <w:left w:val="nil" w:sz="0" w:space="0" w:color="000000" tmln="20, 20, 20, 0, 0"/>
-          <w:bottom w:val="nil" w:sz="0" w:space="0" w:color="000000" tmln="20, 20, 20, 0, 0"/>
-          <w:right w:val="nil" w:sz="0" w:space="0" w:color="000000" tmln="20, 20, 20, 0, 0"/>
-          <w:between w:val="nil" w:sz="0" w:space="0" w:color="000000" tmln="20, 20, 20, 0, 0"/>
-        </w:pBdr>
-        <w:shd w:val="none"/>
+      <w:r>
         <w:rPr>
           <w:sz w:val="24"/>
           <w:szCs w:val="24"/>
         </w:rPr>
-      </w:pPr>
-      <w:r>
+      </w:r>
+    </w:p>
+    <w:p>
+      <w:pPr>
+        <w:pStyle w:val="para2"/>
+        <w:pBdr>
+          <w:top w:val="nil" w:sz="0" w:space="0" w:color="000000" tmln="20, 20, 20, 0, 0"/>
+          <w:left w:val="nil" w:sz="0" w:space="0" w:color="000000" tmln="20, 20, 20, 0, 0"/>
+          <w:bottom w:val="nil" w:sz="0" w:space="0" w:color="000000" tmln="20, 20, 20, 0, 0"/>
+          <w:right w:val="nil" w:sz="0" w:space="0" w:color="000000" tmln="20, 20, 20, 0, 0"/>
+          <w:between w:val="nil" w:sz="0" w:space="0" w:color="000000" tmln="20, 20, 20, 0, 0"/>
+        </w:pBdr>
+        <w:shd w:val="none"/>
         <w:rPr>
           <w:sz w:val="24"/>
           <w:szCs w:val="24"/>
         </w:rPr>
-        <w:t>CORE COMPETENCIES</w:t>
-      </w:r>
-    </w:p>
-    <w:p>
-      <w:pPr>
-        <w:keepNext/>
-        <w:keepLines/>
-        <w:pBdr>
-          <w:top w:val="nil" w:sz="0" w:space="0" w:color="000000" tmln="20, 20, 20, 0, 0"/>
-          <w:left w:val="nil" w:sz="0" w:space="0" w:color="000000" tmln="20, 20, 20, 0, 0"/>
-          <w:bottom w:val="nil" w:sz="0" w:space="0" w:color="000000" tmln="20, 20, 20, 0, 0"/>
-          <w:right w:val="nil" w:sz="0" w:space="0" w:color="000000" tmln="20, 20, 20, 0, 0"/>
-          <w:between w:val="nil" w:sz="0" w:space="0" w:color="000000" tmln="20, 20, 20, 0, 0"/>
-        </w:pBdr>
-        <w:shd w:val="none"/>
-        <w:rPr>
-          <w:rFonts w:ascii="Arial" w:hAnsi="Arial" w:eastAsia="Arial" w:cs="Arial"/>
-          <w:sz w:val="22"/>
-          <w:szCs w:val="22"/>
-        </w:rPr>
-      </w:pPr>
-      <w:r>
-        <w:rPr>
-          <w:rFonts w:ascii="Arial" w:hAnsi="Arial" w:eastAsia="Arial" w:cs="Arial"/>
-          <w:sz w:val="22"/>
-          <w:szCs w:val="22"/>
-        </w:rPr>
-        <w:t>Quality Assurance • Game Development • C++ • C# • Unreal Engine 5 • Engine 5 Blueprints • Unity • Software Engineering • AI Programming • Game Architecture • Procedural Generation • UI Design • Problem-Solving • Team Collaboration • Visual Studio 2022 • GitHub</w:t>
-      </w:r>
-    </w:p>
-    <w:p>
-      <w:pPr>
-        <w:pStyle w:val="para2"/>
-        <w:pBdr>
-          <w:top w:val="nil" w:sz="0" w:space="0" w:color="000000" tmln="20, 20, 20, 0, 0"/>
-          <w:left w:val="nil" w:sz="0" w:space="0" w:color="000000" tmln="20, 20, 20, 0, 0"/>
-          <w:bottom w:val="nil" w:sz="0" w:space="0" w:color="000000" tmln="20, 20, 20, 0, 0"/>
-          <w:right w:val="nil" w:sz="0" w:space="0" w:color="000000" tmln="20, 20, 20, 0, 0"/>
-          <w:between w:val="nil" w:sz="0" w:space="0" w:color="000000" tmln="20, 20, 20, 0, 0"/>
-        </w:pBdr>
-        <w:shd w:val="none"/>
+      </w:pPr>
+      <w:r>
         <w:rPr>
           <w:sz w:val="24"/>
           <w:szCs w:val="24"/>
         </w:rPr>
-      </w:pPr>
+        <w:t>CORE COMPETENCIES</w:t>
+      </w:r>
       <w:r>
         <w:rPr>
           <w:sz w:val="24"/>
           <w:szCs w:val="24"/>
         </w:rPr>
+      </w:r>
+    </w:p>
+    <w:p>
+      <w:pPr>
+        <w:keepNext/>
+        <w:keepLines/>
+        <w:pBdr>
+          <w:top w:val="nil" w:sz="0" w:space="0" w:color="000000" tmln="20, 20, 20, 0, 0"/>
+          <w:left w:val="nil" w:sz="0" w:space="0" w:color="000000" tmln="20, 20, 20, 0, 0"/>
+          <w:bottom w:val="nil" w:sz="0" w:space="0" w:color="000000" tmln="20, 20, 20, 0, 0"/>
+          <w:right w:val="nil" w:sz="0" w:space="0" w:color="000000" tmln="20, 20, 20, 0, 0"/>
+          <w:between w:val="nil" w:sz="0" w:space="0" w:color="000000" tmln="20, 20, 20, 0, 0"/>
+        </w:pBdr>
+        <w:shd w:val="none"/>
+        <w:rPr>
+          <w:rFonts w:ascii="Arial" w:hAnsi="Arial" w:eastAsia="Arial" w:cs="Arial"/>
+          <w:sz w:val="22"/>
+          <w:szCs w:val="22"/>
+        </w:rPr>
+      </w:pPr>
+      <w:r>
+        <w:rPr>
+          <w:rFonts w:ascii="Arial" w:hAnsi="Arial" w:eastAsia="Arial" w:cs="Arial"/>
+          <w:sz w:val="22"/>
+          <w:szCs w:val="22"/>
+        </w:rPr>
+        <w:t>Quality Assurance • Game Development • C++ • C# • Unreal Engine 5 • Engine 5 Blueprints • Unity • Software Engineering • AI Programming • Game Architecture • Procedural Generation • UI Design • Problem-Solving • Team Collaboration • Visual Studio 2022 • GitHub</w:t>
+      </w:r>
+      <w:r>
+        <w:rPr>
+          <w:rFonts w:ascii="Arial" w:hAnsi="Arial" w:eastAsia="Arial" w:cs="Arial"/>
+          <w:sz w:val="22"/>
+          <w:szCs w:val="22"/>
+        </w:rPr>
+      </w:r>
+    </w:p>
+    <w:p>
+      <w:pPr>
+        <w:pStyle w:val="para2"/>
+        <w:pBdr>
+          <w:top w:val="nil" w:sz="0" w:space="0" w:color="000000" tmln="20, 20, 20, 0, 0"/>
+          <w:left w:val="nil" w:sz="0" w:space="0" w:color="000000" tmln="20, 20, 20, 0, 0"/>
+          <w:bottom w:val="nil" w:sz="0" w:space="0" w:color="000000" tmln="20, 20, 20, 0, 0"/>
+          <w:right w:val="nil" w:sz="0" w:space="0" w:color="000000" tmln="20, 20, 20, 0, 0"/>
+          <w:between w:val="nil" w:sz="0" w:space="0" w:color="000000" tmln="20, 20, 20, 0, 0"/>
+        </w:pBdr>
+        <w:shd w:val="none"/>
+        <w:rPr>
+          <w:sz w:val="24"/>
+          <w:szCs w:val="24"/>
+        </w:rPr>
+      </w:pPr>
+      <w:r>
+        <w:rPr>
+          <w:sz w:val="24"/>
+          <w:szCs w:val="24"/>
+        </w:rPr>
         <w:t>SUMMARY</w:t>
       </w:r>
+      <w:r>
+        <w:rPr>
+          <w:sz w:val="24"/>
+          <w:szCs w:val="24"/>
+        </w:rPr>
+      </w:r>
     </w:p>
     <w:p>
       <w:pPr>
@@ -243,6 +274,13 @@
           <w:szCs w:val="22"/>
         </w:rPr>
         <w:t>Programming graduate with expertise in software engineering and game development, known for exceptional problem-solving abilities and high-quality code implementation; experienced in developing advanced AI systems, procedural generation, and user interface design; skilled in quality assurance testing for indie and major studio releases. Passionate about creating engaging gaming experiences through innovative programming solutions.</w:t>
+      </w:r>
+      <w:r>
+        <w:rPr>
+          <w:rFonts w:ascii="Arial" w:hAnsi="Arial" w:eastAsia="Arial" w:cs="Arial"/>
+          <w:sz w:val="22"/>
+          <w:szCs w:val="22"/>
+        </w:rPr>
       </w:r>
     </w:p>
     <w:p>
@@ -276,6 +314,13 @@
         </w:rPr>
         <w:t>Developed simple AI for multiple enemy types and boss characters</w:t>
       </w:r>
+      <w:r>
+        <w:rPr>
+          <w:rFonts w:ascii="Arial" w:hAnsi="Arial" w:eastAsia="Arial" w:cs="Arial"/>
+          <w:sz w:val="22"/>
+          <w:szCs w:val="22"/>
+        </w:rPr>
+      </w:r>
     </w:p>
     <w:p>
       <w:pPr>
@@ -308,6 +353,13 @@
         </w:rPr>
         <w:t>Created comprehensive UI/UX solutions including health systems.</w:t>
       </w:r>
+      <w:r>
+        <w:rPr>
+          <w:rFonts w:ascii="Arial" w:hAnsi="Arial" w:eastAsia="Arial" w:cs="Arial"/>
+          <w:sz w:val="22"/>
+          <w:szCs w:val="22"/>
+        </w:rPr>
+      </w:r>
     </w:p>
     <w:p>
       <w:pPr>
@@ -340,6 +392,13 @@
         </w:rPr>
         <w:t>Engineered robust interaction systems using advanced collision detection and ray-casting technologies</w:t>
       </w:r>
+      <w:r>
+        <w:rPr>
+          <w:rFonts w:ascii="Arial" w:hAnsi="Arial" w:eastAsia="Arial" w:cs="Arial"/>
+          <w:sz w:val="22"/>
+          <w:szCs w:val="22"/>
+        </w:rPr>
+      </w:r>
     </w:p>
     <w:p>
       <w:pPr>
@@ -364,6 +423,12 @@
         </w:rPr>
         <w:t>EXPERIENCE</w:t>
       </w:r>
+      <w:r>
+        <w:rPr>
+          <w:sz w:val="24"/>
+          <w:szCs w:val="24"/>
+        </w:rPr>
+      </w:r>
     </w:p>
     <w:p>
       <w:pPr>
@@ -400,6 +465,13 @@
         </w:rPr>
         <w:t xml:space="preserve"> | January 2023 - November 2025</w:t>
       </w:r>
+      <w:r>
+        <w:rPr>
+          <w:rFonts w:ascii="Arial" w:hAnsi="Arial" w:eastAsia="Arial" w:cs="Arial"/>
+          <w:sz w:val="22"/>
+          <w:szCs w:val="22"/>
+        </w:rPr>
+      </w:r>
     </w:p>
     <w:p>
       <w:pPr>
@@ -435,6 +507,13 @@
           <w:szCs w:val="22"/>
         </w:rPr>
         <w:t xml:space="preserve"> </w:t>
+      </w:r>
+      <w:r>
+        <w:rPr>
+          <w:rFonts w:ascii="Arial" w:hAnsi="Arial" w:eastAsia="Arial" w:cs="Arial"/>
+          <w:sz w:val="22"/>
+          <w:szCs w:val="22"/>
+        </w:rPr>
       </w:r>
     </w:p>
     <w:p>
@@ -468,6 +547,13 @@
         </w:rPr>
         <w:t>Conducts comprehensive QA testing for indie and major studio game releases, identifying bugs and design inconsistencies across multiple platforms</w:t>
       </w:r>
+      <w:r>
+        <w:rPr>
+          <w:rFonts w:ascii="Arial" w:hAnsi="Arial" w:eastAsia="Arial" w:cs="Arial"/>
+          <w:sz w:val="22"/>
+          <w:szCs w:val="22"/>
+        </w:rPr>
+      </w:r>
     </w:p>
     <w:p>
       <w:pPr>
@@ -500,6 +586,13 @@
         </w:rPr>
         <w:t>Provides detailed feedback on gameplay mechanics, UI design, and player experience to development teams, contributing to refined game mechanics and enhanced usability</w:t>
       </w:r>
+      <w:r>
+        <w:rPr>
+          <w:rFonts w:ascii="Arial" w:hAnsi="Arial" w:eastAsia="Arial" w:cs="Arial"/>
+          <w:sz w:val="22"/>
+          <w:szCs w:val="22"/>
+        </w:rPr>
+      </w:r>
     </w:p>
     <w:p>
       <w:pPr>
@@ -532,6 +625,13 @@
         </w:rPr>
         <w:t>Collaborates with developers to implement quality improvements based on user behavior analysis and testing insights</w:t>
       </w:r>
+      <w:r>
+        <w:rPr>
+          <w:rFonts w:ascii="Arial" w:hAnsi="Arial" w:eastAsia="Arial" w:cs="Arial"/>
+          <w:sz w:val="22"/>
+          <w:szCs w:val="22"/>
+        </w:rPr>
+      </w:r>
     </w:p>
     <w:p>
       <w:pPr>
@@ -589,19 +689,7 @@
         </w:rPr>
         <w:t>Provalus - Corckett, TX - November 2025 - Present</w:t>
       </w:r>
-    </w:p>
-    <w:p>
-      <w:pPr>
-        <w:keepNext/>
-        <w:keepLines/>
-        <w:pBdr>
-          <w:top w:val="nil" w:sz="0" w:space="0" w:color="000000" tmln="20, 20, 20, 0, 0"/>
-          <w:left w:val="nil" w:sz="0" w:space="0" w:color="000000" tmln="20, 20, 20, 0, 0"/>
-          <w:bottom w:val="nil" w:sz="0" w:space="0" w:color="000000" tmln="20, 20, 20, 0, 0"/>
-          <w:right w:val="nil" w:sz="0" w:space="0" w:color="000000" tmln="20, 20, 20, 0, 0"/>
-          <w:between w:val="nil" w:sz="0" w:space="0" w:color="000000" tmln="20, 20, 20, 0, 0"/>
-        </w:pBdr>
-        <w:shd w:val="none"/>
+      <w:r>
         <w:rPr>
           <w:rFonts w:ascii="Arial" w:hAnsi="Arial" w:eastAsia="Arial" w:cs="Arial"/>
           <w:b/>
@@ -609,8 +697,20 @@
           <w:sz w:val="22"/>
           <w:szCs w:val="22"/>
         </w:rPr>
-      </w:pPr>
-      <w:r>
+      </w:r>
+    </w:p>
+    <w:p>
+      <w:pPr>
+        <w:keepNext/>
+        <w:keepLines/>
+        <w:pBdr>
+          <w:top w:val="nil" w:sz="0" w:space="0" w:color="000000" tmln="20, 20, 20, 0, 0"/>
+          <w:left w:val="nil" w:sz="0" w:space="0" w:color="000000" tmln="20, 20, 20, 0, 0"/>
+          <w:bottom w:val="nil" w:sz="0" w:space="0" w:color="000000" tmln="20, 20, 20, 0, 0"/>
+          <w:right w:val="nil" w:sz="0" w:space="0" w:color="000000" tmln="20, 20, 20, 0, 0"/>
+          <w:between w:val="nil" w:sz="0" w:space="0" w:color="000000" tmln="20, 20, 20, 0, 0"/>
+        </w:pBdr>
+        <w:shd w:val="none"/>
         <w:rPr>
           <w:rFonts w:ascii="Arial" w:hAnsi="Arial" w:eastAsia="Arial" w:cs="Arial"/>
           <w:b/>
@@ -618,7 +718,25 @@
           <w:sz w:val="22"/>
           <w:szCs w:val="22"/>
         </w:rPr>
+      </w:pPr>
+      <w:r>
+        <w:rPr>
+          <w:rFonts w:ascii="Arial" w:hAnsi="Arial" w:eastAsia="Arial" w:cs="Arial"/>
+          <w:b/>
+          <w:bCs/>
+          <w:sz w:val="22"/>
+          <w:szCs w:val="22"/>
+        </w:rPr>
         <w:t>Customer Service Analyst</w:t>
+      </w:r>
+      <w:r>
+        <w:rPr>
+          <w:rFonts w:ascii="Arial" w:hAnsi="Arial" w:eastAsia="Arial" w:cs="Arial"/>
+          <w:b/>
+          <w:bCs/>
+          <w:sz w:val="22"/>
+          <w:szCs w:val="22"/>
+        </w:rPr>
       </w:r>
     </w:p>
     <w:p>
@@ -652,6 +770,13 @@
         </w:rPr>
         <w:t>Serve as the first point of contact for end users experiencing technical issues via phone, email, chat, or ticketing system.</w:t>
       </w:r>
+      <w:r>
+        <w:rPr>
+          <w:rFonts w:ascii="Arial" w:hAnsi="Arial" w:eastAsia="Arial" w:cs="Arial"/>
+          <w:sz w:val="22"/>
+          <w:szCs w:val="22"/>
+        </w:rPr>
+      </w:r>
     </w:p>
     <w:p>
       <w:pPr>
@@ -684,6 +809,13 @@
         </w:rPr>
         <w:t>Diagnose and resolve hardware, software, and connectivity issues across desktops, laptops, printers, mobile devices, and remote access tools (e.g., VPN).</w:t>
       </w:r>
+      <w:r>
+        <w:rPr>
+          <w:rFonts w:ascii="Arial" w:hAnsi="Arial" w:eastAsia="Arial" w:cs="Arial"/>
+          <w:sz w:val="22"/>
+          <w:szCs w:val="22"/>
+        </w:rPr>
+      </w:r>
     </w:p>
     <w:p>
       <w:pPr>
@@ -716,6 +848,13 @@
         </w:rPr>
         <w:t>Perform password resets, account unlocks, and basic user account provisioning and de-provisioning.</w:t>
       </w:r>
+      <w:r>
+        <w:rPr>
+          <w:rFonts w:ascii="Arial" w:hAnsi="Arial" w:eastAsia="Arial" w:cs="Arial"/>
+          <w:sz w:val="22"/>
+          <w:szCs w:val="22"/>
+        </w:rPr>
+      </w:r>
     </w:p>
     <w:p>
       <w:pPr>
@@ -748,6 +887,13 @@
         </w:rPr>
         <w:t>Install, configure, and update software and applications according to standard procedures.</w:t>
       </w:r>
+      <w:r>
+        <w:rPr>
+          <w:rFonts w:ascii="Arial" w:hAnsi="Arial" w:eastAsia="Arial" w:cs="Arial"/>
+          <w:sz w:val="22"/>
+          <w:szCs w:val="22"/>
+        </w:rPr>
+      </w:r>
     </w:p>
     <w:p>
       <w:pPr>
@@ -780,6 +926,13 @@
         </w:rPr>
         <w:t>Log, track, and update tickets accurately and thoroughly in the ITSM/ticketing system, following each issue through to resolution.</w:t>
       </w:r>
+      <w:r>
+        <w:rPr>
+          <w:rFonts w:ascii="Arial" w:hAnsi="Arial" w:eastAsia="Arial" w:cs="Arial"/>
+          <w:sz w:val="22"/>
+          <w:szCs w:val="22"/>
+        </w:rPr>
+      </w:r>
     </w:p>
     <w:p>
       <w:pPr>
@@ -812,6 +965,13 @@
         </w:rPr>
         <w:t>Managing customer records, recording call details, inquiries, complaints, actions taken and updating the CRM.</w:t>
       </w:r>
+      <w:r>
+        <w:rPr>
+          <w:rFonts w:ascii="Arial" w:hAnsi="Arial" w:eastAsia="Arial" w:cs="Arial"/>
+          <w:sz w:val="22"/>
+          <w:szCs w:val="22"/>
+        </w:rPr>
+      </w:r>
     </w:p>
     <w:p>
       <w:pPr>
@@ -844,6 +1004,13 @@
         </w:rPr>
         <w:t>Following up complicated customer calls where required.</w:t>
       </w:r>
+      <w:r>
+        <w:rPr>
+          <w:rFonts w:ascii="Arial" w:hAnsi="Arial" w:eastAsia="Arial" w:cs="Arial"/>
+          <w:sz w:val="22"/>
+          <w:szCs w:val="22"/>
+        </w:rPr>
+      </w:r>
     </w:p>
     <w:p>
       <w:pPr>
@@ -867,6 +1034,12 @@
           <w:szCs w:val="24"/>
         </w:rPr>
         <w:t>PROJECTS &amp; DEVELOPMENT EXPERIENCE</w:t>
+      </w:r>
+      <w:r>
+        <w:rPr>
+          <w:sz w:val="24"/>
+          <w:szCs w:val="24"/>
+        </w:rPr>
       </w:r>
     </w:p>
     <w:p>
@@ -963,6 +1136,13 @@
         </w:rPr>
         <w:t xml:space="preserve">Developed two unique enemy types and boss characters with basic AI behaviors </w:t>
       </w:r>
+      <w:r>
+        <w:rPr>
+          <w:rFonts w:ascii="Arial" w:hAnsi="Arial" w:eastAsia="Arial" w:cs="Arial"/>
+          <w:sz w:val="22"/>
+          <w:szCs w:val="22"/>
+        </w:rPr>
+      </w:r>
     </w:p>
     <w:p>
       <w:pPr>
@@ -995,6 +1175,13 @@
         </w:rPr>
         <w:t>Successfully balanced AI difficulty and ensured boss fairness, delivering engaging but predictable yet hard to deal with enemies.</w:t>
       </w:r>
+      <w:r>
+        <w:rPr>
+          <w:rFonts w:ascii="Arial" w:hAnsi="Arial" w:eastAsia="Arial" w:cs="Arial"/>
+          <w:sz w:val="22"/>
+          <w:szCs w:val="22"/>
+        </w:rPr>
+      </w:r>
     </w:p>
     <w:p>
       <w:pPr>
@@ -1081,6 +1268,13 @@
         </w:rPr>
         <w:t>Designed and implemented procedural dungeon generator creating randomized layouts with adaptive challenges tailored to player progression</w:t>
       </w:r>
+      <w:r>
+        <w:rPr>
+          <w:rFonts w:ascii="Arial" w:hAnsi="Arial" w:eastAsia="Arial" w:cs="Arial"/>
+          <w:sz w:val="22"/>
+          <w:szCs w:val="22"/>
+        </w:rPr>
+      </w:r>
     </w:p>
     <w:p>
       <w:pPr>
@@ -1113,6 +1307,13 @@
         </w:rPr>
         <w:t>Overcame technical challenges related to level connectivity, replayability, and performance optimization, delivering dynamic environments that enhance replay value</w:t>
       </w:r>
+      <w:r>
+        <w:rPr>
+          <w:rFonts w:ascii="Arial" w:hAnsi="Arial" w:eastAsia="Arial" w:cs="Arial"/>
+          <w:sz w:val="22"/>
+          <w:szCs w:val="22"/>
+        </w:rPr>
+      </w:r>
     </w:p>
     <w:p>
       <w:r/>
@@ -1481,6 +1682,11 @@
           <w:rFonts w:ascii="Arial" w:hAnsi="Arial" w:eastAsia="Arial" w:cs="Arial"/>
         </w:rPr>
         <w:t xml:space="preserve"> | February 7, 2025</w:t>
+      </w:r>
+      <w:r>
+        <w:rPr>
+          <w:rFonts w:ascii="Arial" w:hAnsi="Arial" w:eastAsia="Arial" w:cs="Arial"/>
+        </w:rPr>
       </w:r>
     </w:p>
     <w:p>

</xml_diff>